<commit_message>
Record R2.1 Mac delivery and refresh system report
</commit_message>
<xml_diff>
--- a/docs/current_report/ADC_Current_System_Report_20261018.docx
+++ b/docs/current_report/ADC_Current_System_Report_20261018.docx
@@ -15,12 +15,12 @@
         <w:pStyle w:val="Subtitle"/>
       </w:pPr>
       <w:r>
-        <w:t>R1 delivery and R2 implementation plan 系统开发进展与下一阶段规划</w:t>
+        <w:t>R2.1 delivery and next operational stage 系统开发进展与运行保障</w:t>
       </w:r>
     </w:p>
     <w:p>
       <w:r>
-        <w:t>Report date 2026-10-18   Application baseline 6a06f35   R2 status PLANNED</w:t>
+        <w:t>Report date 2026-10-18   Application ccdcdcd   R2.1 DELIVERED   R2 IN PROGRESS</w:t>
       </w:r>
     </w:p>
     <w:p>
@@ -33,17 +33,17 @@
     </w:p>
     <w:p>
       <w:r>
-        <w:t>R1 financial evidence is delivered on the Mac and in GitHub. The next implementation is R2 operational assurance（运行保障）: explain failures safely, detect stalled work and stale recovery copies, then rehearse a controlled recovery. Keep the current transactional Django and PostgreSQL architecture while strengthening module contracts.</w:t>
+        <w:t>R2.1 request tracing and safe operational logs（请求追踪与安全运行日志）are delivered on the Mac and in GitHub. Failed operations now have a server reference that connects safe application, server and gateway events. Existing financial approval, clinical permissions and business history remain intact. The next implementation is R2.2 worker and backlog observation.</w:t>
       </w:r>
     </w:p>
     <w:p>
       <w:r>
-        <w:t>The agreed product is one dental chain with approximately 5-20 clinics. Existing capacity evidence covers five clinics on this Mac. The system continues to use synthetic data（合成数据）, CNY and Asia/Shanghai business dates; external AI is disabled. The new plan does not establish twenty-clinic capacity, independent hosting or commercial readiness.</w:t>
+        <w:t>The agreed product remains one dental chain with approximately 5-20 clinics. Data is synthetic（合成数据）, business currency/time are CNY and Asia/Shanghai, and external AI remains unused. Twenty-clinic capacity, independent hosting and commercial readiness remain separate acceptance targets.</w:t>
       </w:r>
     </w:p>
     <w:p>
       <w:r>
-        <w:t>This report updates the system analysis, delivery evidence and next implementation sequence as of 18 October 2026. The application observations below were accepted on 15 October 2026 at commit 6a06f35 [3-4]. R2 requirements and thresholds are proposed work, not newly executed tests.</w:t>
+        <w:t>This revision records R2.1 execution on 18 October 2026 at application commit ccdcdcd [11-13]. R1 results dated 15 October 2026 remain historical [3-4]. Future R2 monitoring thresholds, thirty-minute capacity repetition and twenty-four-hour observation have not been accepted by this release.</w:t>
       </w:r>
     </w:p>
     <w:tbl>
@@ -190,7 +190,7 @@
               <w:rPr>
                 <w:sz w:val="20"/>
               </w:rPr>
-              <w:t>R1 payment evidence and independently reviewed reconciliation delivered</w:t>
+              <w:t>R1 financial evidence retained; R2.1 diagnosis/logging delivered</w:t>
             </w:r>
           </w:p>
         </w:tc>
@@ -257,7 +257,7 @@
               <w:rPr>
                 <w:sz w:val="20"/>
               </w:rPr>
-              <w:t>908 source checks; 1,106 PostgreSQL/HTTP/concurrency tests</w:t>
+              <w:t>918 source checks; 1,119 PostgreSQL/HTTP/concurrency tests</w:t>
             </w:r>
           </w:p>
         </w:tc>
@@ -324,7 +324,7 @@
               <w:rPr>
                 <w:sz w:val="20"/>
               </w:rPr>
-              <w:t>2,423 isolated checks; 205 further checks on the updated Mac</w:t>
+              <w:t>894 isolated assertions; 410 on the updated original Mac</w:t>
             </w:r>
           </w:p>
         </w:tc>
@@ -360,7 +360,7 @@
               <w:rPr>
                 <w:sz w:val="20"/>
               </w:rPr>
-              <w:t>Capacity</w:t>
+              <w:t>Historical capacity</w:t>
             </w:r>
           </w:p>
         </w:tc>
@@ -391,7 +391,7 @@
               <w:rPr>
                 <w:sz w:val="20"/>
               </w:rPr>
-              <w:t>Five clinics, twenty accounts, 30 minutes; 9,000 requests</w:t>
+              <w:t>R1: five clinics, twenty accounts, 30 minutes; 9,000 requests</w:t>
             </w:r>
           </w:p>
         </w:tc>
@@ -458,7 +458,7 @@
               <w:rPr>
                 <w:sz w:val="20"/>
               </w:rPr>
-              <w:t>50 model/association fingerprints match after encrypted empty-target restore</w:t>
+              <w:t>R2.1: 50 independent restore fingerprints; 48 durable Mac fingerprints preserved</w:t>
             </w:r>
           </w:p>
         </w:tc>
@@ -525,7 +525,7 @@
               <w:rPr>
                 <w:sz w:val="20"/>
               </w:rPr>
-              <w:t>R2.1 request correlation and safe structured operational logs</w:t>
+              <w:t>R2.2 worker heartbeat, due backlog and private condition reporting</w:t>
             </w:r>
           </w:p>
         </w:tc>
@@ -549,7 +549,7 @@
         <w:t xml:space="preserve">Mind map 思维导图  </w:t>
       </w:r>
       <w:r>
-        <w:t>ADC → delivered R1 {money evidence, permissions, recovery} → planned R2 {diagnosis, observation, response} → independent host and measured expansion.</w:t>
+        <w:t>ADC → delivered R1 money evidence + R2.1 safe diagnosis → next R2.2 observation → recovery freshness → independent host and measured expansion.</w:t>
       </w:r>
     </w:p>
     <w:p>
@@ -1663,7 +1663,7 @@
     </w:p>
     <w:p>
       <w:r>
-        <w:t>Importing or matching never posts money, changes an invoice or invents a balancing entry. The five-clinic browser scenarios cover partial receipts, refunds, equipment payments/reversals and evidence correction. After additional load-time review, 29 matches are confirmed and one prior decision remains stale; 5,031 statement lines are retained. Those are deliberately bounded synthetic scenarios, not a real reconciliation coverage rate [3].</w:t>
+        <w:t>Importing or matching never posts money, changes an invoice or invents a balancing entry. The historical R1 browser scenarios accepted on 15 October cover partial receipts, refunds, equipment payments/reversals and evidence correction. In that R1 run, after additional load-time review, 29 matches are confirmed and one prior decision remains stale; 5,031 statement lines are retained. Those are deliberately bounded synthetic scenarios, not a real reconciliation coverage rate [3].</w:t>
       </w:r>
     </w:p>
     <w:p>
@@ -1692,7 +1692,12 @@
     </w:p>
     <w:p>
       <w:r>
-        <w:t>R1 separates source checks, database behavior, real-browser interaction, resource observation and independent recovery. The published acceptance record contains positive and adverse cases, retained failures and the final corrected results [3]. Assertion counts describe executed checks, not coverage percentages.</w:t>
+        <w:t>R2.1 separates real database behavior, browser workflows, proxy/command sinks, size rotation and encrypted recovery. Counts describe executed checks, not coverage percentages. The local acceptance and protected Mac delivery records are separate [11-13].</w:t>
+      </w:r>
+    </w:p>
+    <w:p>
+      <w:r>
+        <w:t>The five-clinic SQL oracle independently retains receipts of CNY 50,100.10, refunds of 100.10 and net patient cash of 50,000.00. Equipment expense and reversal are CNY 50.05 each. Invalid requests, CSV errors and technical logging create no balancing cash or invoice changes.</w:t>
       </w:r>
     </w:p>
     <w:tbl>
@@ -1772,7 +1777,7 @@
                 <w:color w:val="FFFFFF"/>
                 <w:sz w:val="20"/>
               </w:rPr>
-              <w:t>R1 observation</w:t>
+              <w:t>R2.1 observation</w:t>
             </w:r>
           </w:p>
         </w:tc>
@@ -1839,7 +1844,7 @@
               <w:rPr>
                 <w:sz w:val="20"/>
               </w:rPr>
-              <w:t>908 source checks; 1,106 PostgreSQL/HTTP/concurrency methods; 41 new R1 database methods</w:t>
+              <w:t>918 source checks; 1,119 PostgreSQL/HTTP/concurrency tests, including 13 new R2.1 methods</w:t>
             </w:r>
           </w:p>
         </w:tc>
@@ -1875,7 +1880,7 @@
               <w:rPr>
                 <w:sz w:val="20"/>
               </w:rPr>
-              <w:t>Browser</w:t>
+              <w:t>Chrome</w:t>
             </w:r>
           </w:p>
         </w:tc>
@@ -1906,7 +1911,7 @@
               <w:rPr>
                 <w:sz w:val="20"/>
               </w:rPr>
-              <w:t>2,423 isolated assertions; seven roles and foreign-clinic probes before, during and after load</w:t>
+              <w:t>568 business + 248 permission/isolation + 78 diagnostic/keyboard/narrow-layout assertions</w:t>
             </w:r>
           </w:p>
         </w:tc>
@@ -1942,7 +1947,7 @@
               <w:rPr>
                 <w:sz w:val="20"/>
               </w:rPr>
-              <w:t>Mixed load</w:t>
+              <w:t>Real log correlation</w:t>
             </w:r>
           </w:p>
         </w:tc>
@@ -1973,7 +1978,7 @@
               <w:rPr>
                 <w:sz w:val="20"/>
               </w:rPr>
-              <w:t>9,000 requests: 7,200 reads and 1,800 valid writes across twenty accounts</w:t>
+              <w:t>28 browser requests match across Django, Gunicorn and Nginx; 63 private marker values absent</w:t>
             </w:r>
           </w:p>
         </w:tc>
@@ -2009,7 +2014,7 @@
               <w:rPr>
                 <w:sz w:val="20"/>
               </w:rPr>
-              <w:t>Latency and resources</w:t>
+              <w:t>Candidate gateway</w:t>
             </w:r>
           </w:p>
         </w:tc>
@@ -2040,7 +2045,7 @@
               <w:rPr>
                 <w:sz w:val="20"/>
               </w:rPr>
-              <w:t>p95 0.337 s; maximum 0.7315 s; no unexpected failure, duplicate effects, OOM, restart or deadlock</w:t>
+              <w:t>133 distinct references; login GETs stay outside POST login budget; expected 403/429 cases</w:t>
             </w:r>
           </w:p>
         </w:tc>
@@ -2076,7 +2081,7 @@
               <w:rPr>
                 <w:sz w:val="20"/>
               </w:rPr>
-              <w:t>Independent writes</w:t>
+              <w:t>Size rotation</w:t>
             </w:r>
           </w:p>
         </w:tc>
@@ -2107,7 +2112,7 @@
               <w:rPr>
                 <w:sz w:val="20"/>
               </w:rPr>
-              <w:t>900 unique patient creations and 900 exact draft-note saves; original money/invoice facts unchanged</w:t>
+              <w:t>250,000 records; 143,591 retained including the final record; production 10m/three-file options</w:t>
             </w:r>
           </w:p>
         </w:tc>
@@ -2143,7 +2148,7 @@
               <w:rPr>
                 <w:sz w:val="20"/>
               </w:rPr>
-              <w:t>Ancillary work</w:t>
+              <w:t>Independent facts</w:t>
             </w:r>
           </w:p>
         </w:tc>
@@ -2174,7 +2179,7 @@
               <w:rPr>
                 <w:sz w:val="20"/>
               </w:rPr>
-              <w:t>Five 1,000-row imports and five independent match approvals inside the measured window</w:t>
+              <w:t>20 SQL/content assertions; 24 confirmed matches, one retained stale decision and 30 accepted lines</w:t>
             </w:r>
           </w:p>
         </w:tc>
@@ -2241,7 +2246,7 @@
               <w:rPr>
                 <w:sz w:val="20"/>
               </w:rPr>
-              <w:t>50 model/association fingerprints match; recorded local restore-and-compare interval 2.556 s</w:t>
+              <w:t>50 model/association fingerprints match; recorded same-Mac empty-target restore/compare 2.452 s</w:t>
             </w:r>
           </w:p>
         </w:tc>
@@ -2308,7 +2313,7 @@
               <w:rPr>
                 <w:sz w:val="20"/>
               </w:rPr>
-              <w:t>43 original models and 70 private configuration files preserved; RC tag retained; 205 browser checks</w:t>
+              <w:t>48 durable fingerprints and 70 private files preserved; same data volume and RC tag; 410 browser assertions</w:t>
             </w:r>
           </w:p>
         </w:tc>
@@ -2321,12 +2326,7 @@
     </w:p>
     <w:p>
       <w:r>
-        <w:t>The independent financial oracle retains receipts of CNY 50,100.10 and refunds of CNY 100.10, giving net patient cash of CNY 50,000.00. Equipment expense and reversal are CNY 50.05 each. Imports and matching do not change these amounts.</w:t>
-      </w:r>
-    </w:p>
-    <w:p>
-      <w:r>
-        <w:t>The workload uses Linux containers on a Mac with limits totaling two CPU cores and 1,728 MiB. It does not reproduce an independent 2 GB cloud server. The RC owner database identity was used; production runtime-role separation was not measured. Keyboard preview/explicit confirmation and 390px large-text layouts were checked; native macOS menu option selection was not automatically verified.</w:t>
+        <w:t>The mixed workload remains R1 historical evidence: five clinics, twenty accounts, 9,000 requests over thirty minutes, p95 0.337 s, under two-CPU/1,728-MiB limits. It was not repeated for R2.1. New restore and gateway checks are local; they do not establish off-host recovery or independent cloud service. Native macOS popup-menu option selection remains outside the earlier automatic acceptance.</w:t>
       </w:r>
     </w:p>
     <w:p>
@@ -2337,7 +2337,7 @@
         <w:t xml:space="preserve">Mind map 思维导图  </w:t>
       </w:r>
       <w:r>
-        <w:t>Layered tests → independent money facts → continuous workload and resources → separate encrypted restore → exact-commit CI → original Mac preservation.</w:t>
+        <w:t>Adversarial inputs → actual three-layer correlation → seven-role business outcomes → independent money facts → size rotation → encrypted restore → exact-commit CI and original Mac preservation.</w:t>
       </w:r>
     </w:p>
     <w:p>
@@ -2355,7 +2355,7 @@
     </w:p>
     <w:p>
       <w:r>
-        <w:t>The next problem is operational responsibility. When a front-desk settlement fails, staff need a safe support reference and a clear instruction to check stored state before resubmitting. When coordination notices stop, the operator needs to distinguish an idle worker from an unavailable database or overdue work. When a backup exists, the owner needs its real recovery point and restoration evidence.</w:t>
+        <w:t>R2.1 addresses safe diagnosis when reception, clinical or settlement requests fail: staff receive a support reference and are asked to check stored state before repeating uncertain work. The remaining operational problems are timely detection of stalled coordination notices, an unavailable observer and stale recovery points.</w:t>
       </w:r>
     </w:p>
     <w:p>
@@ -2507,7 +2507,7 @@
               <w:rPr>
                 <w:sz w:val="20"/>
               </w:rPr>
-              <w:t>Server request ID and safe JSON events; no secret, clinical, CSV or submitted URL/body data</w:t>
+              <w:t>Delivered: server reference and strict safe events; no submitted secret, clinical, CSV or URL/body values</w:t>
             </w:r>
           </w:p>
         </w:tc>
@@ -2574,7 +2574,7 @@
               <w:rPr>
                 <w:sz w:val="20"/>
               </w:rPr>
-              <w:t>Bounded logging and documented access/retention; financial history is not pruned as operational noise</w:t>
+              <w:t>Delivered size bounds and sink inventory; strict time expiry/protected collection remain gaps</w:t>
             </w:r>
           </w:p>
         </w:tc>
@@ -2641,7 +2641,7 @@
               <w:rPr>
                 <w:sz w:val="20"/>
               </w:rPr>
-              <w:t>Fresh worker-loop success and indexed due-backlog age; future retry and human read stay distinct</w:t>
+              <w:t>Next: successful worker-loop freshness and eligible due-backlog age; future retry and human read stay distinct</w:t>
             </w:r>
           </w:p>
         </w:tc>
@@ -2708,7 +2708,7 @@
               <w:rPr>
                 <w:sz w:val="20"/>
               </w:rPr>
-              <w:t>Private HEALTHY/WARNING/CRITICAL/UNKNOWN state; acknowledgement never clears the underlying fault</w:t>
+              <w:t>Planned: private HEALTHY/WARNING/CRITICAL/UNKNOWN; acknowledgement does not clear the fault</w:t>
             </w:r>
           </w:p>
         </w:tc>
@@ -2775,7 +2775,7 @@
               <w:rPr>
                 <w:sz w:val="20"/>
               </w:rPr>
-              <w:t>Separate backup, verified download and independent restore points; original running database is protected</w:t>
+              <w:t>Planned: separate created/downloaded/restored points and controlled independent recovery</w:t>
             </w:r>
           </w:p>
         </w:tc>
@@ -2788,12 +2788,7 @@
     </w:p>
     <w:p>
       <w:r>
-        <w:t>Use private operator commands/files first. The platform operator diagnoses infrastructure; authorized clinic staff resume their workflow and finance verifies money independently. This adds no business role, public metrics endpoint, new business REST API or automatic financial action. SYSADMIN remains an account-governance role, distinct from private host access.</w:t>
-      </w:r>
-    </w:p>
-    <w:p>
-      <w:r>
-        <w:t>Keep the modular monolith（模块化单体）and existing worker. Do not introduce a large monitoring stack or separate services before their resource and ownership need is demonstrated. Business audit and operational logs have different responsibilities [2,5].</w:t>
+        <w:t>Keep the modular monolith（模块化单体）and current worker. Operational logging queries no permissions or business objects and omits role/clinic identifiers. The business module still owns its audit and transaction; operational metadata is a separate diagnostic responsibility [2,5].</w:t>
       </w:r>
     </w:p>
     <w:p>
@@ -2817,17 +2812,17 @@
         <w:pStyle w:val="Heading1"/>
       </w:pPr>
       <w:r>
-        <w:t>6 First implementation batch 首轮实施合同</w:t>
+        <w:t>6 Delivered safe diagnosis 已交付的故障定位能力</w:t>
       </w:r>
     </w:p>
     <w:p>
       <w:r>
-        <w:t>R2.1 will implement request correlation and safe structured operational logging. At request entry, the server generates the support ID and returns it in X-Request-ID. A client header cannot choose that ID. Completion and safe failure events share the same request context; concurrency and exceptions must not leak context between requests.</w:t>
+        <w:t>At request entry the server creates the reference and returns X-Request-ID. Client headers cannot choose it. Context is reset after completion or exceptions; later Django warning records reuse the immutable server context on the request. The gateway uses the application reference for proxied outcomes and generates a fallback for its own refusals.</w:t>
       </w:r>
     </w:p>
     <w:p>
       <w:r>
-        <w:t>The JSON vocabulary allows UTC time, severity, service, reviewed source commit, event code, request ID, route name, HTTP method/status and duration. Role/clinic metadata requires a validated current workspace. Metric labels must remain bounded; request IDs and business identifiers must not become labels.</w:t>
+        <w:t>The JSON formatter allows UTC time, severity, service, identified source or unknown, finite event code, server reference, resolved route, normalized method/status and bounded duration. It never formats arbitrary messages, arguments, exception strings or locals. Authentication events omit entered credentials; references confer no record authority.</w:t>
       </w:r>
     </w:p>
     <w:tbl>
@@ -2943,7 +2938,7 @@
               <w:rPr>
                 <w:sz w:val="20"/>
               </w:rPr>
-              <w:t>Context ownership</w:t>
+              <w:t>Context</w:t>
             </w:r>
           </w:p>
         </w:tc>
@@ -2974,7 +2969,7 @@
               <w:rPr>
                 <w:sz w:val="20"/>
               </w:rPr>
-              <w:t>Separate adc_core request context/middleware; preserve existing security middleware ordering</w:t>
+              <w:t>Separate request module and context variables; original security/workspace middleware order preserved</w:t>
             </w:r>
           </w:p>
         </w:tc>
@@ -3010,7 +3005,7 @@
               <w:rPr>
                 <w:sz w:val="20"/>
               </w:rPr>
-              <w:t>Log minimization</w:t>
+              <w:t>Safe failures</w:t>
             </w:r>
           </w:p>
         </w:tc>
@@ -3041,7 +3036,7 @@
               <w:rPr>
                 <w:sz w:val="20"/>
               </w:rPr>
-              <w:t>Allowlist fields; bounded reason/exception codes; cover framework, gateway and worker sinks</w:t>
+              <w:t>Generic error and support reference; 500 renderer performs no database context queries</w:t>
             </w:r>
           </w:p>
         </w:tc>
@@ -3077,7 +3072,7 @@
               <w:rPr>
                 <w:sz w:val="20"/>
               </w:rPr>
-              <w:t>Safe failure</w:t>
+              <w:t>Sinks</w:t>
             </w:r>
           </w:p>
         </w:tc>
@@ -3108,7 +3103,7 @@
               <w:rPr>
                 <w:sz w:val="20"/>
               </w:rPr>
-              <w:t>Show generic error plus support reference; never SQL, credentials, tokens or internal payloads</w:t>
+              <w:t>Django/Gunicorn/gateway request events controlled; runtime command stderr sanitized; compatible worker aggregate output</w:t>
             </w:r>
           </w:p>
         </w:tc>
@@ -3144,7 +3139,7 @@
               <w:rPr>
                 <w:sz w:val="20"/>
               </w:rPr>
-              <w:t>Atomic business behavior</w:t>
+              <w:t>Native capture</w:t>
             </w:r>
           </w:p>
         </w:tc>
@@ -3175,7 +3170,7 @@
               <w:rPr>
                 <w:sz w:val="20"/>
               </w:rPr>
-              <w:t>Logging failure cannot widen authority or rewrite success; required audit failure still rolls back business</w:t>
+              <w:t>Database errors can quote submitted values; native DB and credential-bootstrap capture disabled</w:t>
             </w:r>
           </w:p>
         </w:tc>
@@ -3211,7 +3206,7 @@
               <w:rPr>
                 <w:sz w:val="20"/>
               </w:rPr>
-              <w:t>Storage</w:t>
+              <w:t>Business atomicity</w:t>
             </w:r>
           </w:p>
         </w:tc>
@@ -3242,7 +3237,7 @@
               <w:rPr>
                 <w:sz w:val="20"/>
               </w:rPr>
-              <w:t>Proposed 10 MiB × 3 files per container; at most seven days, possibly earlier size rotation</w:t>
+              <w:t>Optional log failure preserves success/denial; required financial audit failure still rolls back</w:t>
             </w:r>
           </w:p>
         </w:tc>
@@ -3278,7 +3273,7 @@
               <w:rPr>
                 <w:sz w:val="20"/>
               </w:rPr>
-              <w:t>Verification</w:t>
+              <w:t>Storage</w:t>
             </w:r>
           </w:p>
         </w:tc>
@@ -3309,7 +3304,7 @@
               <w:rPr>
                 <w:sz w:val="20"/>
               </w:rPr>
-              <w:t>Forged header, parallel requests, denied access, secret markers and log I/O failure cases</w:t>
+              <w:t>Docker local nominal 10 MiB × 3 files per captured container; size rotation verified, no seven-day deletion claim</w:t>
             </w:r>
           </w:p>
         </w:tc>
@@ -3322,12 +3317,7 @@
     </w:p>
     <w:p>
       <w:r>
-        <w:t>Do not log names, entered usernames, request bodies, CSV bytes/references, treatment notes, cookies, authorization headers, signed previews, workspace tokens, raw object paths or unrestricted exception messages/locals. Log encoding must prevent injection. Keep business audit as the authoritative retained history [6-8].</w:t>
-      </w:r>
-    </w:p>
-    <w:p>
-      <w:r>
-        <w:t>This batch needs no business schema migration. Before delivery, run targeted and existing regression tests, exercise affected login/settlement/evidence/equipment error paths in Chrome, require passing exact-commit CI and compare original Mac data/configuration after the protected update.</w:t>
+        <w:t>Actual checks cover forged references, parallel success/failure, delayed framework logs, login/CSRF, sensitive markers, stale equipment forms and invalid receipts/CSV. Diagnostic metadata, retained financial audit and private operator evidence remain separate [6-8,11]. No business migration, new role, public metrics API or automatic business action was introduced.</w:t>
       </w:r>
     </w:p>
     <w:p>
@@ -3338,7 +3328,7 @@
         <w:t xml:space="preserve">Mind map 思维导图  </w:t>
       </w:r>
       <w:r>
-        <w:t>Server correlation → allowed metadata → safe errors → encoded private bounded logs → parallel/adverse tests → preserved financial audit and permissions.</w:t>
+        <w:t>Server reference → existing permission/transaction → strict safe events → matching proxy outcome → bounded private storage → preserved audit and independent review.</w:t>
       </w:r>
     </w:p>
     <w:p>
@@ -3356,7 +3346,7 @@
     </w:p>
     <w:p>
       <w:r>
-        <w:t>The following values are proposed engineering defaults for testing. They are not achieved service-level results. Sample every thirty seconds and report stale or missing observations as UNKNOWN. An idle worker is healthy when its database-backed loop is current and no overdue eligible events exist.</w:t>
+        <w:t>These are proposed R2.2/R2.3 engineering defaults, not achieved service results. R2.1 provides diagnostic records and size bounds; it does not yet collect worker/backup conditions or manage incidents. Missing observations must be UNKNOWN. An idle worker should be healthy when its database-backed loop is current and no overdue eligible events exist.</w:t>
       </w:r>
     </w:p>
     <w:tbl>
@@ -3990,7 +3980,7 @@
     </w:p>
     <w:p>
       <w:r>
-        <w:t>Recover only into a distinct empty target with matching source/image/schema provenance. Compare accounts, grants, business/association rows, all four cash legs, evidence versions, original CSV byte digests and match history. Target thirty minutes after the replacement environment is ready. R1’s 2.556-second local interval does not promise cloud replacement time.</w:t>
+        <w:t>Recover only into a distinct empty target with matching source/image/schema provenance. Compare accounts, grants, business/association rows, all four cash legs, evidence versions, original CSV byte digests and match history. Target thirty minutes after the replacement environment is ready. R2.1’s 2.452-second local interval does not promise cloud replacement time.</w:t>
       </w:r>
     </w:p>
     <w:p>
@@ -4006,7 +3996,7 @@
         <w:t xml:space="preserve">Mind map 思维导图  </w:t>
       </w:r>
       <w:r>
-        <w:t>Worker + due queue + observer freshness → explicit condition; created → downloaded/decrypted → independently restored point → actual recovery exposure.</w:t>
+        <w:t>Delivered diagnosis → proposed worker/backlog/observer freshness → explicit future condition; created → downloaded/decrypted → independently restored point → actual recovery exposure.</w:t>
       </w:r>
     </w:p>
     <w:p>
@@ -4024,7 +4014,7 @@
     </w:p>
     <w:p>
       <w:r>
-        <w:t>Develop R2 in bounded increments. Each increment must preserve original data, history, role scope and independent finance review. Destructive fault injection belongs only to an identified disposable rehearsal, with failed attempts retained.</w:t>
+        <w:t>R2.1 is delivered with passing application-commit CI, local execution and protected Mac comparison. Continue with bounded R2.2 increments. Each must preserve original data, role scope and independent finance review. Destructive fault injection stays inside an identified disposable rehearsal.</w:t>
       </w:r>
     </w:p>
     <w:tbl>
@@ -4171,7 +4161,7 @@
               <w:rPr>
                 <w:sz w:val="20"/>
               </w:rPr>
-              <w:t>Request context, safe JSON logs and inventory; parallel/privacy/error acceptance</w:t>
+              <w:t>Delivered: references, strict events, safe errors, measured rotation and protected local release</w:t>
             </w:r>
           </w:p>
         </w:tc>
@@ -4238,7 +4228,7 @@
               <w:rPr>
                 <w:sz w:val="20"/>
               </w:rPr>
-              <w:t>Heartbeat, due-age, private collector and incident lifecycle; prove observer failure is visible</w:t>
+              <w:t>Next: heartbeat, due age, private collector and condition/incident lifecycle; expose observer failure</w:t>
             </w:r>
           </w:p>
         </w:tc>
@@ -4484,7 +4474,7 @@
     </w:p>
     <w:p>
       <w:r>
-        <w:t>The full R2 plan defines R2-A01 through R2-A12 and their independent observations [9]. Local R2 acceptance and cloud acceptance have separate statuses. After R2, keep the agreed sequence: R3 longitudinal treatment plans, R4 resource/maintenance coordination, then R5 measured twenty-clinic expansion.</w:t>
+        <w:t>The full plan defines R2-A01 through R2-A12 [9]. R2.1 contributes reference/privacy/permission, storage and recovery evidence; it does not pass every full-R2 gate. Local R2 acceptance and cloud acceptance remain separate. Then retain the agreed sequence: R3 treatment continuity, R4 resource coordination and R5 measured twenty-clinic expansion.</w:t>
       </w:r>
     </w:p>
     <w:p>
@@ -4513,7 +4503,7 @@
     </w:p>
     <w:p>
       <w:r>
-        <w:t>Pin the security assessment to OWASP ASVS 5.0.0. Existing route, grant, object and deidentified-projection tests support an assessment; they do not constitute a standard-wide pass. The new register distinguishes evidence needing review, gaps, actual-host dependencies and product exclusions [6,10].</w:t>
+        <w:t>Use OWASP ASVS 5.0.0 for the scoped assessment. R2.1 request/context, safe-sink and retained-business tests now support evidence review; they do not establish a standard-wide pass. The register keeps time retention, protected independent collection, session/MFA and target-host work explicit [6,10-11].</w:t>
       </w:r>
     </w:p>
     <w:tbl>
@@ -4660,7 +4650,7 @@
               <w:rPr>
                 <w:sz w:val="20"/>
               </w:rPr>
-              <w:t>R2 targets inventory, correlation, time, minimal data, encoded events and safe failure</w:t>
+              <w:t>Implemented R2.1 inventory, correlation, UTC/minimal fields, safe failures and adversarial evidence; assess complete controls</w:t>
             </w:r>
           </w:p>
         </w:tc>
@@ -4727,7 +4717,7 @@
               <w:rPr>
                 <w:sz w:val="20"/>
               </w:rPr>
-              <w:t>Private access/rotation must be verified; separate protected collection remains a deployment gap</w:t>
+              <w:t>Size rotation verified; seven-day deletion and separate protected collection remain gaps; native text suppression reduces forensic detail</w:t>
             </w:r>
           </w:p>
         </w:tc>
@@ -5008,12 +4998,12 @@
     </w:p>
     <w:p>
       <w:r>
-        <w:t>This revision delivers the current report and development plan. Deployment credentials and recovery keys remain private. The application continues to use synthetic data, and the documentation update requires no application restart.</w:t>
+        <w:t>The application is updated on the original Mac after exact-commit CI. Encrypted before/after backups are verified; original durable facts, configuration, volume and RC tag remain. Documentation is synchronized separately. No test business records are injected into the original Mac.</w:t>
       </w:r>
     </w:p>
     <w:p>
       <w:r>
-        <w:t>A local observation window cannot prove mainland access, certificate renewal, service while the Mac is offline or replacement-host recovery. Complete those on the actual independent host before declaring the course online release ready. Original Windows-data recovery remains unresolved.</w:t>
+        <w:t>Local checks cannot establish mainland access, real certificate issuance/renewal, service while the Mac is offline or replacement-host recovery. Cloud acceptance awaits server details. Original Windows-data recovery remains unresolved.</w:t>
       </w:r>
     </w:p>
     <w:p>
@@ -5042,17 +5032,17 @@
     </w:p>
     <w:p>
       <w:r>
-        <w:t>The course notes supply the requirements and design framework. Official engineering references guide the proposed R2 contracts. ADC records establish the executed R1 results. The proposed thresholds and development sequence are project decisions, not performance claims made by the reference systems.</w:t>
+        <w:t>The course notes provide the requirements/design framework; official references guide engineering mechanisms. R1 observations remain dated 15 October 2026. R2.1 local acceptance and original-Mac delivery are dated 18 October 2026, with identified application commit ccdcdcd and passing CI [11-13].</w:t>
       </w:r>
     </w:p>
     <w:p>
       <w:r>
-        <w:t>Report revision date: 2026-10-18 in the project owner’s client date context. R1 evidence date: 2026-10-15 UTC. Aggregate Mac delivery records establish the 43-model/70-configuration preservation and 205-browser-check summary; private keys, credentials, dumps, CSV source contents and private deployment configuration are excluded from this report.</w:t>
+        <w:t>Editable report_source.json and build_report.py produce Word and Markdown; PDF pages are visually inspected. baseline.json binds aggregate evidence and delivery hashes. Credentials, keys, dumps, patient data and CSV source bytes remain private. The frozen 63-page RC1 report, original thirty migrations and RC tag preserve their historical identities.</w:t>
       </w:r>
     </w:p>
     <w:p>
       <w:r>
-        <w:t>Editable report_source.json and build_report.py generate the Word and Markdown texts; PDF pagination is visually checked after export. The original 63-page RC1 report, original migrations and original RC tag retain their historical identities.</w:t>
+        <w:t>Report revision date: 2026-10-18 in the project owner’s client date context. Historical R1 evidence remains dated 2026-10-15 UTC. The separate R2.1 delivery record binds 48 durable-model/association fingerprints, 70 unchanged private files and 410 Mac browser assertions to this application release.</w:t>
       </w:r>
     </w:p>
     <w:p>
@@ -5166,11 +5156,11 @@
           <w:rPr>
             <w:color w:val="1F4E79"/>
           </w:rPr>
-          <w:t>Docker logging configuration</w:t>
+          <w:t>Docker local logging driver</w:t>
         </w:r>
       </w:hyperlink>
       <w:r>
-        <w:t>. Explicit bounded logging-driver configuration.</w:t>
+        <w:t>. Size-based options; no time-expiry acceptance is claimed.</w:t>
       </w:r>
     </w:p>
     <w:p>
@@ -5207,13 +5197,61 @@
     </w:p>
     <w:p>
       <w:r>
+        <w:t xml:space="preserve">[11] </w:t>
+      </w:r>
+      <w:hyperlink r:id="rId19">
+        <w:r>
+          <w:rPr>
+            <w:color w:val="1F4E79"/>
+          </w:rPr>
+          <w:t>ADC R2.1 executed local acceptance</w:t>
+        </w:r>
+      </w:hyperlink>
+      <w:r>
+        <w:t>. Regression, real-browser/sink/gateway, money and encrypted-restore results.</w:t>
+      </w:r>
+    </w:p>
+    <w:p>
+      <w:r>
+        <w:t xml:space="preserve">[12] </w:t>
+      </w:r>
+      <w:hyperlink r:id="rId20">
+        <w:r>
+          <w:rPr>
+            <w:color w:val="1F4E79"/>
+          </w:rPr>
+          <w:t>Exact R2.1 application CI</w:t>
+        </w:r>
+      </w:hyperlink>
+      <w:r>
+        <w:t>. Successful workflow for ccdcdcd.</w:t>
+      </w:r>
+    </w:p>
+    <w:p>
+      <w:r>
+        <w:t xml:space="preserve">[13] </w:t>
+      </w:r>
+      <w:hyperlink r:id="rId21">
+        <w:r>
+          <w:rPr>
+            <w:color w:val="1F4E79"/>
+          </w:rPr>
+          <w:t>ADC protected Mac delivery record</w:t>
+        </w:r>
+      </w:hyperlink>
+      <w:r>
+        <w:t>. Original data/configuration protection and post-update verification.</w:t>
+      </w:r>
+    </w:p>
+    <w:p>
+      <w:r>
         <w:rPr>
           <w:b/>
         </w:rPr>
         <w:t xml:space="preserve">Mind map 思维导图  </w:t>
       </w:r>
       <w:r>
-        <w:t>Course requirements/design → official engineering references → immutable R1 observations → proposed R2 contract → executed future evidence.</w:t>
+        <w:t>Course requirements/design → official mechanisms → immutable R1 observations → executed R2.1 acceptance → original Mac delivery → pending R2.2 and independent host.</w:t>
       </w:r>
     </w:p>
     <w:sectPr>

</xml_diff>